<commit_message>
Valide section documents bureautiques
</commit_message>
<xml_diff>
--- a/_source/sami-doc-aide-correction.docx
+++ b/_source/sami-doc-aide-correction.docx
@@ -30,12 +30,20 @@
       </w:r>
     </w:p>
     <w:p>
+      <w:commentRangeStart w:id="2"/>
       <w:r>
         <w:t>Ce rapport trimestriel présente les résultats de communication numérique de la Direction des affaires juridiques pour le premier trimestre 2025. Il couvre les principaux indicateurs de performance de nos canaux digitaux.</w:t>
       </w:r>
+      <w:commentRangeEnd w:id="2"/>
+      <w:r>
+        <w:rPr>
+          <w:rStyle w:val="CommentReference"/>
+        </w:rPr>
+        <w:commentReference w:id="2"/>
+      </w:r>
     </w:p>
     <w:p>
-      <w:commentRangeStart w:id="2"/>
+      <w:commentRangeStart w:id="3"/>
       <w:r>
         <w:rPr>
           <w:rFonts w:ascii="Arial" w:hAnsi="Arial"/>
@@ -45,12 +53,12 @@
         </w:rPr>
         <w:t>Sommaire</w:t>
       </w:r>
-      <w:commentRangeEnd w:id="2"/>
+      <w:commentRangeEnd w:id="3"/>
       <w:r>
         <w:rPr>
           <w:rStyle w:val="CommentReference"/>
         </w:rPr>
-        <w:commentReference w:id="2"/>
+        <w:commentReference w:id="3"/>
       </w:r>
     </w:p>
     <w:p>
@@ -80,7 +88,7 @@
     </w:p>
     <w:p/>
     <w:p>
-      <w:commentRangeStart w:id="3"/>
+      <w:commentRangeStart w:id="4"/>
       <w:r>
         <w:rPr>
           <w:rFonts w:ascii="Arial" w:hAnsi="Arial"/>
@@ -89,12 +97,12 @@
         </w:rPr>
         <w:t>Urgent - Retour attendu avant le 30 juin 2025</w:t>
       </w:r>
-      <w:commentRangeEnd w:id="3"/>
+      <w:commentRangeEnd w:id="4"/>
       <w:r>
         <w:rPr>
           <w:rStyle w:val="CommentReference"/>
         </w:rPr>
-        <w:commentReference w:id="3"/>
+        <w:commentReference w:id="4"/>
       </w:r>
     </w:p>
     <w:p>
@@ -103,7 +111,7 @@
       </w:r>
     </w:p>
     <w:p>
-      <w:commentRangeStart w:id="4"/>
+      <w:commentRangeStart w:id="5"/>
       <w:r>
         <w:rPr>
           <w:rFonts w:ascii="Arial" w:hAnsi="Arial"/>
@@ -113,12 +121,12 @@
         </w:rPr>
         <w:t>Résultats du trimestre</w:t>
       </w:r>
-      <w:commentRangeEnd w:id="4"/>
+      <w:commentRangeEnd w:id="5"/>
       <w:r>
         <w:rPr>
           <w:rStyle w:val="CommentReference"/>
         </w:rPr>
-        <w:commentReference w:id="4"/>
+        <w:commentReference w:id="5"/>
       </w:r>
     </w:p>
     <w:tbl>
@@ -139,16 +147,16 @@
             <w:tcW w:type="dxa" w:w="2160"/>
           </w:tcPr>
           <w:p>
-            <w:commentRangeStart w:id="5"/>
+            <w:commentRangeStart w:id="6"/>
             <w:r>
               <w:t>Indicateur</w:t>
             </w:r>
-            <w:commentRangeEnd w:id="5"/>
+            <w:commentRangeEnd w:id="6"/>
             <w:r>
               <w:rPr>
                 <w:rStyle w:val="CommentReference"/>
               </w:rPr>
-              <w:commentReference w:id="5"/>
+              <w:commentReference w:id="6"/>
             </w:r>
           </w:p>
         </w:tc>
@@ -157,16 +165,16 @@
             <w:tcW w:type="dxa" w:w="2160"/>
           </w:tcPr>
           <w:p>
-            <w:commentRangeStart w:id="6"/>
+            <w:commentRangeStart w:id="7"/>
             <w:r>
               <w:t>T4 2024</w:t>
             </w:r>
-            <w:commentRangeEnd w:id="6"/>
+            <w:commentRangeEnd w:id="7"/>
             <w:r>
               <w:rPr>
                 <w:rStyle w:val="CommentReference"/>
               </w:rPr>
-              <w:commentReference w:id="6"/>
+              <w:commentReference w:id="7"/>
             </w:r>
           </w:p>
         </w:tc>
@@ -331,7 +339,7 @@
       <w:pPr>
         <w:ind w:left="504" w:hanging="259"/>
       </w:pPr>
-      <w:commentRangeStart w:id="7"/>
+      <w:commentRangeStart w:id="8"/>
       <w:r>
         <w:rPr>
           <w:rFonts w:ascii="Arial" w:hAnsi="Arial"/>
@@ -341,12 +349,12 @@
         <w:tab/>
         <w:t>Augmenter le trafic de 10 %</w:t>
       </w:r>
-      <w:commentRangeEnd w:id="7"/>
+      <w:commentRangeEnd w:id="8"/>
       <w:r>
         <w:rPr>
           <w:rStyle w:val="CommentReference"/>
         </w:rPr>
-        <w:commentReference w:id="7"/>
+        <w:commentReference w:id="8"/>
       </w:r>
     </w:p>
     <w:p>
@@ -374,19 +382,19 @@
         </w:rPr>
         <w:t>•</w:t>
         <w:tab/>
-        <w:t>Reduire le taux de rebond sous 40 %</w:t>
+        <w:t>Réduire le taux de rebond sous 40 %</w:t>
       </w:r>
     </w:p>
     <w:p>
       <w:r>
-        <w:t>Priorites pour le prochain trimestre :</w:t>
+        <w:t>Priorités pour le prochain trimestre :</w:t>
       </w:r>
     </w:p>
     <w:p>
       <w:pPr>
         <w:ind w:left="504" w:hanging="259"/>
       </w:pPr>
-      <w:commentRangeStart w:id="8"/>
+      <w:commentRangeStart w:id="9"/>
       <w:r>
         <w:rPr>
           <w:rFonts w:ascii="Arial" w:hAnsi="Arial"/>
@@ -396,12 +404,12 @@
         <w:tab/>
         <w:t>Refonte de la page d'accueil</w:t>
       </w:r>
-      <w:commentRangeEnd w:id="8"/>
+      <w:commentRangeEnd w:id="9"/>
       <w:r>
         <w:rPr>
           <w:rStyle w:val="CommentReference"/>
         </w:rPr>
-        <w:commentReference w:id="8"/>
+        <w:commentReference w:id="9"/>
       </w:r>
     </w:p>
     <w:p>
@@ -415,7 +423,7 @@
         </w:rPr>
         <w:t>2.</w:t>
         <w:tab/>
-        <w:t>Mise en conformite accessibilite</w:t>
+        <w:t>Mise en conformité accessibilité</w:t>
       </w:r>
     </w:p>
     <w:p>
@@ -429,12 +437,12 @@
         </w:rPr>
         <w:t>3.</w:t>
         <w:tab/>
-        <w:t>Deploiement de la newsletter</w:t>
+        <w:t>Déploiement de la newsletter</w:t>
       </w:r>
     </w:p>
     <w:p/>
     <w:p>
-      <w:commentRangeStart w:id="9"/>
+      <w:commentRangeStart w:id="10"/>
       <w:r>
         <w:rPr>
           <w:rFonts w:ascii="Arial" w:hAnsi="Arial"/>
@@ -445,19 +453,19 @@
         </w:rPr>
         <w:t>Détail par canal</w:t>
       </w:r>
-      <w:commentRangeEnd w:id="9"/>
+      <w:commentRangeEnd w:id="10"/>
       <w:r>
         <w:rPr>
           <w:rStyle w:val="CommentReference"/>
         </w:rPr>
-        <w:commentReference w:id="9"/>
+        <w:commentReference w:id="10"/>
       </w:r>
     </w:p>
     <w:p>
       <w:pPr>
         <w:jc w:val="center"/>
       </w:pPr>
-      <w:commentRangeStart w:id="10"/>
+      <w:commentRangeStart w:id="11"/>
       <w:r>
         <w:drawing>
           <wp:inline xmlns:a="http://schemas.openxmlformats.org/drawingml/2006/main" xmlns:pic="http://schemas.openxmlformats.org/drawingml/2006/picture">
@@ -492,17 +500,17 @@
           </wp:inline>
         </w:drawing>
       </w:r>
-      <w:commentRangeEnd w:id="10"/>
+      <w:commentRangeEnd w:id="11"/>
       <w:r>
         <w:rPr>
           <w:rStyle w:val="CommentReference"/>
         </w:rPr>
-        <w:commentReference w:id="10"/>
+        <w:commentReference w:id="11"/>
       </w:r>
     </w:p>
     <w:p/>
     <w:p>
-      <w:commentRangeStart w:id="11"/>
+      <w:commentRangeStart w:id="12"/>
       <w:r>
         <w:rPr>
           <w:rFonts w:ascii="Arial" w:hAnsi="Arial"/>
@@ -512,19 +520,19 @@
         </w:rPr>
         <w:t>Organisation du service</w:t>
       </w:r>
-      <w:commentRangeEnd w:id="11"/>
+      <w:commentRangeEnd w:id="12"/>
       <w:r>
         <w:rPr>
           <w:rStyle w:val="CommentReference"/>
         </w:rPr>
-        <w:commentReference w:id="11"/>
+        <w:commentReference w:id="12"/>
       </w:r>
     </w:p>
     <w:p>
       <w:pPr>
         <w:jc w:val="center"/>
       </w:pPr>
-      <w:commentRangeStart w:id="12"/>
+      <w:commentRangeStart w:id="13"/>
       <w:r>
         <w:drawing>
           <wp:inline xmlns:a="http://schemas.openxmlformats.org/drawingml/2006/main" xmlns:pic="http://schemas.openxmlformats.org/drawingml/2006/picture">
@@ -559,17 +567,17 @@
           </wp:inline>
         </w:drawing>
       </w:r>
-      <w:commentRangeEnd w:id="12"/>
+      <w:commentRangeEnd w:id="13"/>
       <w:r>
         <w:rPr>
           <w:rStyle w:val="CommentReference"/>
         </w:rPr>
-        <w:commentReference w:id="12"/>
+        <w:commentReference w:id="13"/>
       </w:r>
     </w:p>
     <w:p/>
     <w:p>
-      <w:commentRangeStart w:id="13"/>
+      <w:commentRangeStart w:id="14"/>
       <w:r>
         <w:rPr>
           <w:rFonts w:ascii="Arial" w:hAnsi="Arial"/>
@@ -579,19 +587,19 @@
         </w:rPr>
         <w:t>Contact</w:t>
       </w:r>
-      <w:commentRangeEnd w:id="13"/>
+      <w:commentRangeEnd w:id="14"/>
       <w:r>
         <w:rPr>
           <w:rStyle w:val="CommentReference"/>
         </w:rPr>
-        <w:commentReference w:id="13"/>
+        <w:commentReference w:id="14"/>
       </w:r>
     </w:p>
     <w:p>
       <w:r>
         <w:t xml:space="preserve">Pour toute question, contactez-nous par </w:t>
       </w:r>
-      <w:commentRangeStart w:id="14"/>
+      <w:commentRangeStart w:id="15"/>
       <w:r>
         <w:drawing>
           <wp:inline xmlns:a="http://schemas.openxmlformats.org/drawingml/2006/main" xmlns:pic="http://schemas.openxmlformats.org/drawingml/2006/picture">
@@ -626,22 +634,6 @@
           </wp:inline>
         </w:drawing>
       </w:r>
-      <w:commentRangeEnd w:id="14"/>
-      <w:r>
-        <w:rPr>
-          <w:rStyle w:val="CommentReference"/>
-        </w:rPr>
-        <w:commentReference w:id="14"/>
-      </w:r>
-      <w:r>
-        <w:t xml:space="preserve"> e-mail pour plus d'informations.</w:t>
-      </w:r>
-    </w:p>
-    <w:p>
-      <w:commentRangeStart w:id="15"/>
-      <w:r>
-        <w:t>The quarterly report is available upon request. Please contact the communication department for further details.</w:t>
-      </w:r>
       <w:commentRangeEnd w:id="15"/>
       <w:r>
         <w:rPr>
@@ -649,13 +641,29 @@
         </w:rPr>
         <w:commentReference w:id="15"/>
       </w:r>
+      <w:r>
+        <w:t xml:space="preserve"> e-mail pour plus d'informations.</w:t>
+      </w:r>
+    </w:p>
+    <w:p>
+      <w:commentRangeStart w:id="16"/>
+      <w:r>
+        <w:t>The quarterly report is available upon request. Please contact the communication department for further details.</w:t>
+      </w:r>
+      <w:commentRangeEnd w:id="16"/>
+      <w:r>
+        <w:rPr>
+          <w:rStyle w:val="CommentReference"/>
+        </w:rPr>
+        <w:commentReference w:id="16"/>
+      </w:r>
     </w:p>
     <w:p/>
     <w:p>
       <w:pPr>
         <w:jc w:val="center"/>
       </w:pPr>
-      <w:commentRangeStart w:id="16"/>
+      <w:commentRangeStart w:id="17"/>
       <w:r>
         <w:drawing>
           <wp:inline xmlns:a="http://schemas.openxmlformats.org/drawingml/2006/main" xmlns:pic="http://schemas.openxmlformats.org/drawingml/2006/picture">
@@ -690,17 +698,17 @@
           </wp:inline>
         </w:drawing>
       </w:r>
-      <w:commentRangeEnd w:id="16"/>
+      <w:commentRangeEnd w:id="17"/>
       <w:r>
         <w:rPr>
           <w:rStyle w:val="CommentReference"/>
         </w:rPr>
-        <w:commentReference w:id="16"/>
+        <w:commentReference w:id="17"/>
       </w:r>
     </w:p>
     <w:p/>
     <w:p>
-      <w:commentRangeStart w:id="17"/>
+      <w:commentRangeStart w:id="18"/>
       <w:r>
         <w:rPr>
           <w:rFonts w:ascii="Arial" w:hAnsi="Arial"/>
@@ -710,12 +718,12 @@
         </w:rPr>
         <w:t>Répartition par service</w:t>
       </w:r>
-      <w:commentRangeEnd w:id="17"/>
+      <w:commentRangeEnd w:id="18"/>
       <w:r>
         <w:rPr>
           <w:rStyle w:val="CommentReference"/>
         </w:rPr>
-        <w:commentReference w:id="17"/>
+        <w:commentReference w:id="18"/>
       </w:r>
     </w:p>
     <w:tbl>
@@ -754,7 +762,7 @@
             <w:tcW w:type="dxa" w:w="2880"/>
           </w:tcPr>
           <w:p>
-            <w:commentRangeStart w:id="18"/>
+            <w:commentRangeStart w:id="19"/>
             <w:r>
               <w:rPr>
                 <w:rFonts w:ascii="Arial" w:hAnsi="Arial"/>
@@ -763,12 +771,12 @@
               </w:rPr>
               <w:t>Service</w:t>
             </w:r>
-            <w:commentRangeEnd w:id="18"/>
+            <w:commentRangeEnd w:id="19"/>
             <w:r>
               <w:rPr>
                 <w:rStyle w:val="CommentReference"/>
               </w:rPr>
-              <w:commentReference w:id="18"/>
+              <w:commentReference w:id="19"/>
             </w:r>
           </w:p>
         </w:tc>
@@ -894,7 +902,7 @@
     </w:tbl>
     <w:p/>
     <w:p>
-      <w:commentRangeStart w:id="19"/>
+      <w:commentRangeStart w:id="20"/>
       <w:r>
         <w:rPr>
           <w:rFonts w:ascii="Arial" w:hAnsi="Arial"/>
@@ -904,16 +912,16 @@
         </w:rPr>
         <w:t>ANNEXES</w:t>
       </w:r>
-      <w:commentRangeEnd w:id="19"/>
+      <w:commentRangeEnd w:id="20"/>
       <w:r>
         <w:rPr>
           <w:rStyle w:val="CommentReference"/>
         </w:rPr>
-        <w:commentReference w:id="19"/>
+        <w:commentReference w:id="20"/>
       </w:r>
     </w:p>
     <w:p>
-      <w:commentRangeStart w:id="20"/>
+      <w:commentRangeStart w:id="21"/>
       <w:r>
         <w:t xml:space="preserve">Pour accéder aux annexes, </w:t>
       </w:r>
@@ -929,16 +937,16 @@
       <w:r>
         <w:t>.</w:t>
       </w:r>
-      <w:commentRangeEnd w:id="20"/>
+      <w:commentRangeEnd w:id="21"/>
       <w:r>
         <w:rPr>
           <w:rStyle w:val="CommentReference"/>
         </w:rPr>
-        <w:commentReference w:id="20"/>
+        <w:commentReference w:id="21"/>
       </w:r>
     </w:p>
     <w:p>
-      <w:commentRangeStart w:id="21"/>
+      <w:commentRangeStart w:id="22"/>
       <w:r>
         <w:rPr>
           <w:rFonts w:ascii="Arial" w:hAnsi="Arial"/>
@@ -947,12 +955,12 @@
         </w:rPr>
         <w:t>Note : les données sont provisoires et susceptibles d’ajustements lors de la consolidation finale.</w:t>
       </w:r>
-      <w:commentRangeEnd w:id="21"/>
+      <w:commentRangeEnd w:id="22"/>
       <w:r>
         <w:rPr>
           <w:rStyle w:val="CommentReference"/>
         </w:rPr>
-        <w:commentReference w:id="21"/>
+        <w:commentReference w:id="22"/>
       </w:r>
     </w:p>
     <w:sectPr>
@@ -969,7 +977,7 @@
 
 <file path=word/comments.xml><?xml version="1.0" encoding="utf-8"?>
 <w:comments xmlns:a="http://schemas.openxmlformats.org/drawingml/2006/main" xmlns:pic="http://schemas.openxmlformats.org/drawingml/2006/picture" xmlns:r="http://schemas.openxmlformats.org/officeDocument/2006/relationships" xmlns:w="http://schemas.openxmlformats.org/wordprocessingml/2006/main" xmlns:wp="http://schemas.openxmlformats.org/drawingml/2006/wordprocessingDrawing" xmlns:mc="http://schemas.openxmlformats.org/markup-compatibility/2006" xmlns:a14="http://schemas.microsoft.com/office/drawing/2010/main" xmlns:w14="http://schemas.microsoft.com/office/word/2010/wordml" xmlns:wpc="http://schemas.microsoft.com/office/word/2010/wordprocessingCanvas">
-  <w:comment w:id="0" w:author="Formation IGPDE" w:initials="IGPDE" w:date="2026-05-04T12:59:26Z">
+  <w:comment w:id="0" w:author="Formation IGPDE" w:initials="IGPDE" w:date="2026-05-04T13:06:13Z">
     <w:p>
       <w:pPr>
         <w:pStyle w:val="CommentText"/>
@@ -981,11 +989,11 @@
         <w:annotationRef/>
       </w:r>
       <w:r>
-        <w:t>Critere 1 - Probleme : ce titre est seulement mis en forme en gras/couleur, il n'est pas reconnu comme titre par Word. Impact : la navigation au lecteur d'ecran reste plate. Methode : appliquer Accueil &gt; Styles &gt; Titre 1.</w:t>
+        <w:t>Critère 1 - Problème : ce titre est seulement mis en forme en gras/couleur, il n'est pas reconnu comme titre par Word. Impact : la navigation au lecteur d'écran reste plate. Méthode : appliquer Accueil &gt; Styles &gt; Titre 1.</w:t>
       </w:r>
     </w:p>
   </w:comment>
-  <w:comment w:id="1" w:author="Formation IGPDE" w:initials="IGPDE" w:date="2026-05-04T12:59:26Z">
+  <w:comment w:id="1" w:author="Formation IGPDE" w:initials="IGPDE" w:date="2026-05-04T13:06:13Z">
     <w:p>
       <w:pPr>
         <w:pStyle w:val="CommentText"/>
@@ -997,11 +1005,11 @@
         <w:annotationRef/>
       </w:r>
       <w:r>
-        <w:t>Critere 14 - Probleme : les proprietes du document sont vides. Impact : le fichier est moins identifiable pour les aides techniques et la recherche documentaire. Methode : Fichier &gt; Informations &gt; Proprietes. Titre attendu : Rapport trimestriel - Bilan T1 2025 ; auteur : Sami Dupont.</w:t>
+        <w:t>Critère 14 - Problème : les propriétés du document sont vides. Impact : le fichier est moins identifiable pour les aides techniques et la recherche documentaire. Méthode : Fichier &gt; Informations &gt; Propriétés. Titre attendu : Rapport trimestriel - Bilan T1 2025 ; auteur : Sami Dupont.</w:t>
       </w:r>
     </w:p>
   </w:comment>
-  <w:comment w:id="2" w:author="Formation IGPDE" w:initials="IGPDE" w:date="2026-05-04T12:59:26Z">
+  <w:comment w:id="2" w:author="Formation IGPDE" w:initials="IGPDE" w:date="2026-05-04T13:06:13Z">
     <w:p>
       <w:pPr>
         <w:pStyle w:val="CommentText"/>
@@ -1013,11 +1021,11 @@
         <w:annotationRef/>
       </w:r>
       <w:r>
-        <w:t>Critere 19 - Probleme : ce sommaire est tape a la main. Impact : il n'est ni navigable ni mis a jour automatiquement. Methode : appliquer les styles de titres, puis References &gt; Table des matieres.</w:t>
+        <w:t>Critère 15 - Problème : le texte courant est justifié. Impact : les espaces irréguliers entre les mots peuvent gêner la lecture, notamment pour des personnes dyslexiques ou malvoyantes. Méthode : sélectionner le texte ou le style Normal, puis choisir Accueil &gt; Aligner à gauche.</w:t>
       </w:r>
     </w:p>
   </w:comment>
-  <w:comment w:id="3" w:author="Formation IGPDE" w:initials="IGPDE" w:date="2026-05-04T12:59:26Z">
+  <w:comment w:id="3" w:author="Formation IGPDE" w:initials="IGPDE" w:date="2026-05-04T13:06:13Z">
     <w:p>
       <w:pPr>
         <w:pStyle w:val="CommentText"/>
@@ -1029,11 +1037,11 @@
         <w:annotationRef/>
       </w:r>
       <w:r>
-        <w:t>Critere 5 - Probleme : l'urgence repose surtout sur le rouge. Impact : l'information peut etre perdue sans perception de la couleur. Methode : ajouter une emphase non coloree, par exemple le gras, et conserver un libelle explicite.</w:t>
+        <w:t>Critère 19 - Problème : ce sommaire est tapé à la main. Impact : il n'est ni navigable ni mis à jour automatiquement. Méthode : appliquer les styles de titres, puis Références &gt; Table des matières.</w:t>
       </w:r>
     </w:p>
   </w:comment>
-  <w:comment w:id="4" w:author="Formation IGPDE" w:initials="IGPDE" w:date="2026-05-04T12:59:26Z">
+  <w:comment w:id="4" w:author="Formation IGPDE" w:initials="IGPDE" w:date="2026-05-04T13:06:13Z">
     <w:p>
       <w:pPr>
         <w:pStyle w:val="CommentText"/>
@@ -1045,11 +1053,11 @@
         <w:annotationRef/>
       </w:r>
       <w:r>
-        <w:t>Critere 2 - Probleme : ce sous-titre est seulement visuel. Impact : il ne structure pas le document pour la navigation. Methode : appliquer Accueil &gt; Styles &gt; Titre 2.</w:t>
+        <w:t>Critère 5 - Problème : l'urgence repose surtout sur le rouge. Impact : l'information peut être perdue sans perception de la couleur. Méthode : ajouter une emphase non colorée, par exemple le gras, et conserver un libellé explicite.</w:t>
       </w:r>
     </w:p>
   </w:comment>
-  <w:comment w:id="5" w:author="Formation IGPDE" w:initials="IGPDE" w:date="2026-05-04T12:59:26Z">
+  <w:comment w:id="5" w:author="Formation IGPDE" w:initials="IGPDE" w:date="2026-05-04T13:06:13Z">
     <w:p>
       <w:pPr>
         <w:pStyle w:val="CommentText"/>
@@ -1061,11 +1069,11 @@
         <w:annotationRef/>
       </w:r>
       <w:r>
-        <w:t>Critere 4 - Probleme : la premiere ligne du tableau n'est pas declaree comme en-tete. Impact : les cellules ne sont pas associees a leurs colonnes. Methode : selectionner le tableau &gt; Creation de tableau &gt; Options de style de tableau &gt; Ligne d'en-tete.</w:t>
+        <w:t>Critère 2 - Problème : ce sous-titre est seulement visuel. Impact : il ne structure pas le document pour la navigation. Méthode : appliquer Accueil &gt; Styles &gt; Titre 2.</w:t>
       </w:r>
     </w:p>
   </w:comment>
-  <w:comment w:id="6" w:author="Formation IGPDE" w:initials="IGPDE" w:date="2026-05-04T12:59:26Z">
+  <w:comment w:id="6" w:author="Formation IGPDE" w:initials="IGPDE" w:date="2026-05-04T13:06:13Z">
     <w:p>
       <w:pPr>
         <w:pStyle w:val="CommentText"/>
@@ -1077,11 +1085,11 @@
         <w:annotationRef/>
       </w:r>
       <w:r>
-        <w:t>Critere 16 - Probleme : l'espacement est cree avec des paragraphes vides. Impact : un lecteur d'ecran peut annoncer des vides inutiles. Methode : supprimer ces paragraphes et regler l'espacement avec Mise en page &gt; Paragraphe &gt; Espacement avant/apres ou via les styles.</w:t>
+        <w:t>Critère 4 - Problème : la première ligne du tableau n'est pas déclarée comme en-tête. Impact : les cellules ne sont pas associées à leurs colonnes. Méthode : sélectionner le tableau &gt; Création de tableau &gt; Options de style de tableau &gt; Ligne d'en-tête.</w:t>
       </w:r>
     </w:p>
   </w:comment>
-  <w:comment w:id="7" w:author="Formation IGPDE" w:initials="IGPDE" w:date="2026-05-04T12:59:26Z">
+  <w:comment w:id="7" w:author="Formation IGPDE" w:initials="IGPDE" w:date="2026-05-04T13:06:13Z">
     <w:p>
       <w:pPr>
         <w:pStyle w:val="CommentText"/>
@@ -1093,11 +1101,11 @@
         <w:annotationRef/>
       </w:r>
       <w:r>
-        <w:t>Critere 11 - Probleme : les puces sont tapees au clavier. Impact : Word ne les expose pas comme une liste structuree. Methode : selectionner les items &gt; Accueil &gt; Puces.</w:t>
+        <w:t>Critère 16 - Problème : l'espacement est créé avec des paragraphes vides. Impact : un lecteur d'écran peut annoncer des vides inutiles. Méthode : supprimer ces paragraphes et régler l'espacement avec Mise en page &gt; Paragraphe &gt; Espacement avant/après ou via les styles.</w:t>
       </w:r>
     </w:p>
   </w:comment>
-  <w:comment w:id="8" w:author="Formation IGPDE" w:initials="IGPDE" w:date="2026-05-04T12:59:26Z">
+  <w:comment w:id="8" w:author="Formation IGPDE" w:initials="IGPDE" w:date="2026-05-04T13:06:13Z">
     <w:p>
       <w:pPr>
         <w:pStyle w:val="CommentText"/>
@@ -1109,11 +1117,11 @@
         <w:annotationRef/>
       </w:r>
       <w:r>
-        <w:t>Critere 12 - Probleme : les numeros sont tapes a la main. Impact : la numerotation n'est pas reconnue comme liste. Methode : selectionner les items &gt; Accueil &gt; Numerotation.</w:t>
+        <w:t>Critère 11 - Problème : les puces sont tapées au clavier. Impact : Word ne les expose pas comme une liste structurée. Méthode : sélectionner les éléments de liste &gt; Accueil &gt; Puces.</w:t>
       </w:r>
     </w:p>
   </w:comment>
-  <w:comment w:id="9" w:author="Formation IGPDE" w:initials="IGPDE" w:date="2026-05-04T12:59:26Z">
+  <w:comment w:id="9" w:author="Formation IGPDE" w:initials="IGPDE" w:date="2026-05-04T13:06:13Z">
     <w:p>
       <w:pPr>
         <w:pStyle w:val="CommentText"/>
@@ -1125,11 +1133,11 @@
         <w:annotationRef/>
       </w:r>
       <w:r>
-        <w:t>Critere 3 - Probleme : le soulignement et le gras creent seulement une apparence de titre. Impact : le niveau de titre est absent de la structure. Methode : Accueil &gt; Styles &gt; Titre 3.</w:t>
+        <w:t>Critère 12 - Problème : les numéros sont tapés à la main. Impact : la numérotation n'est pas reconnue comme liste. Méthode : sélectionner les éléments de liste &gt; Accueil &gt; Numérotation.</w:t>
       </w:r>
     </w:p>
   </w:comment>
-  <w:comment w:id="10" w:author="Formation IGPDE" w:initials="IGPDE" w:date="2026-05-04T12:59:26Z">
+  <w:comment w:id="10" w:author="Formation IGPDE" w:initials="IGPDE" w:date="2026-05-04T13:06:13Z">
     <w:p>
       <w:pPr>
         <w:pStyle w:val="CommentText"/>
@@ -1141,11 +1149,11 @@
         <w:annotationRef/>
       </w:r>
       <w:r>
-        <w:t>Critere 7 - Probleme : le graphique n'a pas d'alternative et s'appuie sur la couleur seule. Impact : il est inaccessible au lecteur d'ecran et difficile pour certains daltonismes. Methode : ajouter un alt descriptif, puis utiliser motifs, etiquettes et legende textuelle.</w:t>
+        <w:t>Critère 3 - Problème : le soulignement et le gras créent seulement une apparence de titre. Impact : le niveau de titre est absent de la structure. Méthode : Accueil &gt; Styles &gt; Titre 3.</w:t>
       </w:r>
     </w:p>
   </w:comment>
-  <w:comment w:id="11" w:author="Formation IGPDE" w:initials="IGPDE" w:date="2026-05-04T12:59:26Z">
+  <w:comment w:id="11" w:author="Formation IGPDE" w:initials="IGPDE" w:date="2026-05-04T13:06:13Z">
     <w:p>
       <w:pPr>
         <w:pStyle w:val="CommentText"/>
@@ -1157,11 +1165,11 @@
         <w:annotationRef/>
       </w:r>
       <w:r>
-        <w:t>Titre visuel supplementaire - Probleme : ce titre est formatte directement. Impact : il n'apparait pas dans la navigation. Methode : appliquer le style Titre 2.</w:t>
+        <w:t>Critère 7 - Problème : le graphique n'a pas d'alternative et s'appuie sur la couleur seule. Impact : il est inaccessible au lecteur d'écran et difficile pour certains daltonismes. Méthode : ajouter un texte alternatif descriptif, puis utiliser motifs, étiquettes et légende textuelle.</w:t>
       </w:r>
     </w:p>
   </w:comment>
-  <w:comment w:id="12" w:author="Formation IGPDE" w:initials="IGPDE" w:date="2026-05-04T12:59:26Z">
+  <w:comment w:id="12" w:author="Formation IGPDE" w:initials="IGPDE" w:date="2026-05-04T13:06:13Z">
     <w:p>
       <w:pPr>
         <w:pStyle w:val="CommentText"/>
@@ -1173,11 +1181,11 @@
         <w:annotationRef/>
       </w:r>
       <w:r>
-        <w:t>Critere 9 - Probleme : l'alternative 'image.png' ne decrit pas l'organigramme. Impact : l'information est perdue. Methode : mettre une alternative courte qui renvoie vers une description detaillee dans le corps.</w:t>
+        <w:t>Titre visuel supplémentaire - Problème : ce titre est formaté directement. Impact : il n'apparaît pas dans la navigation. Méthode : appliquer le style Titre 2.</w:t>
       </w:r>
     </w:p>
   </w:comment>
-  <w:comment w:id="13" w:author="Formation IGPDE" w:initials="IGPDE" w:date="2026-05-04T12:59:26Z">
+  <w:comment w:id="13" w:author="Formation IGPDE" w:initials="IGPDE" w:date="2026-05-04T13:06:13Z">
     <w:p>
       <w:pPr>
         <w:pStyle w:val="CommentText"/>
@@ -1189,11 +1197,11 @@
         <w:annotationRef/>
       </w:r>
       <w:r>
-        <w:t>Titre visuel supplementaire - Probleme : ce titre est seulement visuel. Impact : rupture de navigation. Methode : appliquer le style Titre 2.</w:t>
+        <w:t>Critère 9 - Problème : l'alternative 'image.png' ne décrit pas l'organigramme. Impact : l'information est perdue. Méthode : mettre une alternative courte qui renvoie vers une description détaillée dans le corps.</w:t>
       </w:r>
     </w:p>
   </w:comment>
-  <w:comment w:id="14" w:author="Formation IGPDE" w:initials="IGPDE" w:date="2026-05-04T12:59:26Z">
+  <w:comment w:id="14" w:author="Formation IGPDE" w:initials="IGPDE" w:date="2026-05-04T13:06:13Z">
     <w:p>
       <w:pPr>
         <w:pStyle w:val="CommentText"/>
@@ -1205,11 +1213,11 @@
         <w:annotationRef/>
       </w:r>
       <w:r>
-        <w:t>Critere 10 - Probleme : l'icone repete le mot e-mail deja present dans le texte. Impact : redondance a la lecture vocale. Methode : clic droit sur l'image &gt; Afficher le texte de remplacement &gt; Marquer comme decoratif.</w:t>
+        <w:t>Titre visuel supplémentaire - Problème : ce titre est seulement visuel. Impact : rupture de navigation. Méthode : appliquer le style Titre 2.</w:t>
       </w:r>
     </w:p>
   </w:comment>
-  <w:comment w:id="15" w:author="Formation IGPDE" w:initials="IGPDE" w:date="2026-05-04T12:59:26Z">
+  <w:comment w:id="15" w:author="Formation IGPDE" w:initials="IGPDE" w:date="2026-05-04T13:06:13Z">
     <w:p>
       <w:pPr>
         <w:pStyle w:val="CommentText"/>
@@ -1221,11 +1229,11 @@
         <w:annotationRef/>
       </w:r>
       <w:r>
-        <w:t>Critere 13 - Probleme : ce passage anglais n'est pas balise dans sa langue. Impact : il peut etre prononce avec une voix francaise. Methode : selectionner le texte &gt; Revision &gt; Langue &gt; Definir la langue de verification &gt; Anglais.</w:t>
+        <w:t>Critère 10 - Problème : l'icône répète le mot e-mail déjà présent dans le texte. Impact : redondance à la lecture vocale. Méthode : clic droit sur l'image &gt; Afficher le texte de remplacement &gt; Marquer comme décoratif.</w:t>
       </w:r>
     </w:p>
   </w:comment>
-  <w:comment w:id="16" w:author="Formation IGPDE" w:initials="IGPDE" w:date="2026-05-04T12:59:26Z">
+  <w:comment w:id="16" w:author="Formation IGPDE" w:initials="IGPDE" w:date="2026-05-04T13:06:13Z">
     <w:p>
       <w:pPr>
         <w:pStyle w:val="CommentText"/>
@@ -1237,11 +1245,11 @@
         <w:annotationRef/>
       </w:r>
       <w:r>
-        <w:t>Critere 20 - Probleme : ce texte est une image. Impact : il n'est ni selectionnable, ni recherchable, ni fiable en synthese vocale. Methode : le ressaisir en vrai texte Word.</w:t>
+        <w:t>Critère 13 - Problème : ce passage anglais n'est pas balisé dans sa langue. Impact : il peut être prononcé avec une voix française. Méthode : sélectionner le texte &gt; Révision &gt; Langue &gt; Définir la langue de vérification &gt; Anglais.</w:t>
       </w:r>
     </w:p>
   </w:comment>
-  <w:comment w:id="17" w:author="Formation IGPDE" w:initials="IGPDE" w:date="2026-05-04T12:59:26Z">
+  <w:comment w:id="17" w:author="Formation IGPDE" w:initials="IGPDE" w:date="2026-05-04T13:06:13Z">
     <w:p>
       <w:pPr>
         <w:pStyle w:val="CommentText"/>
@@ -1253,11 +1261,11 @@
         <w:annotationRef/>
       </w:r>
       <w:r>
-        <w:t>Critere 21 - Probleme : la premiere ligne fusionnee complexifie la structure du tableau. Impact : les associations cellules/en-tetes deviennent fragiles. Methode : refaire un tableau simple sans fusion et cocher Ligne d'en-tete.</w:t>
+        <w:t>Critère 20 - Problème : ce texte est une image. Impact : il n'est ni sélectionnable, ni recherchable, ni fiable en synthèse vocale. Méthode : le ressaisir en vrai texte Word.</w:t>
       </w:r>
     </w:p>
   </w:comment>
-  <w:comment w:id="18" w:author="Formation IGPDE" w:initials="IGPDE" w:date="2026-05-04T12:59:26Z">
+  <w:comment w:id="18" w:author="Formation IGPDE" w:initials="IGPDE" w:date="2026-05-04T13:06:13Z">
     <w:p>
       <w:pPr>
         <w:pStyle w:val="CommentText"/>
@@ -1269,11 +1277,11 @@
         <w:annotationRef/>
       </w:r>
       <w:r>
-        <w:t>Critere 21 - Probleme : les libelles en gras sont seulement visuels. Impact : ils ne sont pas annonces comme en-tetes. Methode : declarer la ligne d'en-tete avec l'option Word et supprimer la ligne fusionnee.</w:t>
+        <w:t>Critère 21 - Problème : la première ligne fusionnée complexifie la structure du tableau. Impact : les associations cellules/en-têtes deviennent fragiles. Méthode : refaire un tableau simple sans fusion et cocher Ligne d'en-tête.</w:t>
       </w:r>
     </w:p>
   </w:comment>
-  <w:comment w:id="19" w:author="Formation IGPDE" w:initials="IGPDE" w:date="2026-05-04T12:59:26Z">
+  <w:comment w:id="19" w:author="Formation IGPDE" w:initials="IGPDE" w:date="2026-05-04T13:06:13Z">
     <w:p>
       <w:pPr>
         <w:pStyle w:val="CommentText"/>
@@ -1285,11 +1293,11 @@
         <w:annotationRef/>
       </w:r>
       <w:r>
-        <w:t>Critere 17 - Probleme : le mot est tape entierement en capitales. Impact : certaines aides peuvent l'epeler ou le prononcer moins naturellement. Methode : saisir 'Annexes' en minuscules puis appliquer Police &gt; Tout en majuscules si l'effet visuel est voulu.</w:t>
+        <w:t>Critère 21 - Problème : les libellés en gras sont seulement visuels. Impact : ils ne sont pas annoncés comme en-têtes. Méthode : déclarer la ligne d'en-tête avec l'option Word et supprimer la ligne fusionnée.</w:t>
       </w:r>
     </w:p>
   </w:comment>
-  <w:comment w:id="20" w:author="Formation IGPDE" w:initials="IGPDE" w:date="2026-05-04T12:59:26Z">
+  <w:comment w:id="20" w:author="Formation IGPDE" w:initials="IGPDE" w:date="2026-05-04T13:06:13Z">
     <w:p>
       <w:pPr>
         <w:pStyle w:val="CommentText"/>
@@ -1301,11 +1309,11 @@
         <w:annotationRef/>
       </w:r>
       <w:r>
-        <w:t>Critere 8 - Probleme : 'cliquez ici' n'est pas descriptif. Impact : hors contexte, le lien ne dit pas ou il mene. Methode : remplacer par 'Consulter les annexes du rapport T1 2025 (PDF, 1,2 Mo)'.</w:t>
+        <w:t>Critère 17 - Problème : le mot est tapé entièrement en capitales. Impact : certaines aides peuvent l'épeler ou le prononcer moins naturellement. Méthode : saisir 'Annexes' en minuscules puis appliquer Police &gt; Tout en majuscules si l'effet visuel est voulu.</w:t>
       </w:r>
     </w:p>
   </w:comment>
-  <w:comment w:id="21" w:author="Formation IGPDE" w:initials="IGPDE" w:date="2026-05-04T12:59:26Z">
+  <w:comment w:id="21" w:author="Formation IGPDE" w:initials="IGPDE" w:date="2026-05-04T13:06:13Z">
     <w:p>
       <w:pPr>
         <w:pStyle w:val="CommentText"/>
@@ -1317,11 +1325,11 @@
         <w:annotationRef/>
       </w:r>
       <w:r>
-        <w:t>Critere 6 - Probleme : le gris #767676 sur blanc est trop juste pour du petit texte. Impact : la note peut etre difficile a lire. Methode : mesurer le contraste, puis utiliser #595959 ou du noir.</w:t>
+        <w:t>Critère 8 - Problème : 'cliquez ici' n'est pas descriptif. Impact : hors contexte, le lien ne dit pas où il mène. Méthode : remplacer par 'Consulter les annexes du rapport T1 2025 (PDF, 1,2 Mo)'.</w:t>
       </w:r>
     </w:p>
   </w:comment>
-  <w:comment w:id="22" w:author="Formation IGPDE" w:initials="IGPDE" w:date="2026-05-04T12:59:26Z">
+  <w:comment w:id="22" w:author="Formation IGPDE" w:initials="IGPDE" w:date="2026-05-04T13:06:13Z">
     <w:p>
       <w:pPr>
         <w:pStyle w:val="CommentText"/>
@@ -1333,11 +1341,11 @@
         <w:annotationRef/>
       </w:r>
       <w:r>
-        <w:t>Critere 18 - Probleme : le filigrane CONFIDENTIEL est un objet graphique dans l'en-tete. Impact : il peut etre invisible pour les lecteurs d'ecran. Methode : ajouter 'Document confidentiel' en vrai texte dans le corps du document.</w:t>
+        <w:t>Critère 6 - Problème : le gris #767676 sur blanc est trop juste pour du petit texte. Impact : la note peut être difficile à lire. Méthode : mesurer le contraste, puis utiliser #595959 ou du noir.</w:t>
       </w:r>
     </w:p>
   </w:comment>
-  <w:comment w:id="23" w:author="Formation IGPDE" w:initials="IGPDE" w:date="2026-05-04T12:59:26Z">
+  <w:comment w:id="23" w:author="Formation IGPDE" w:initials="IGPDE" w:date="2026-05-04T13:06:13Z">
     <w:p>
       <w:pPr>
         <w:pStyle w:val="CommentText"/>
@@ -1349,7 +1357,7 @@
         <w:annotationRef/>
       </w:r>
       <w:r>
-        <w:t>Critere 15 - Probleme : une information essentielle placee uniquement en en-tete ou pied de page peut etre manquee. Impact : la lecture lineaire n'est pas fiable. Methode : garder les elements de repere en pied de page si besoin, mais reporter l'information essentielle dans le corps.</w:t>
+        <w:t>Critère 18 - Problème : le filigrane CONFIDENTIEL est un objet graphique dans l'en-tête. Impact : il peut être invisible pour les lecteurs d'écran. Méthode : ajouter 'Document confidentiel' en vrai texte dans le corps du document.</w:t>
       </w:r>
     </w:p>
   </w:comment>
@@ -1486,7 +1494,6 @@
       <w:pStyle w:val="Header"/>
       <w:jc w:val="right"/>
     </w:pPr>
-    <w:commentRangeStart w:id="22"/>
     <w:commentRangeStart w:id="23"/>
     <w:r>
       <w:rPr>
@@ -1514,13 +1521,6 @@
           <v:textpath style="font-family:&quot;Arial&quot;;font-size:1pt" string="CONFIDENTIEL"/>
         </v:shape>
       </w:pict>
-    </w:r>
-    <w:commentRangeEnd w:id="22"/>
-    <w:r>
-      <w:rPr>
-        <w:rStyle w:val="CommentReference"/>
-      </w:rPr>
-      <w:commentReference w:id="22"/>
     </w:r>
     <w:commentRangeEnd w:id="23"/>
     <w:r>

</xml_diff>